<commit_message>
feat: HU 5 gestion de citas, agendamiento inteligente y catalogo de servicios
</commit_message>
<xml_diff>
--- a/avances/UH listas.docx
+++ b/avances/UH listas.docx
@@ -445,14 +445,7 @@
           <w:rFonts w:asciiTheme="minorHAnsi" w:hAnsiTheme="minorHAnsi" w:cstheme="minorHAnsi"/>
           <w:lang w:val="es-ES"/>
         </w:rPr>
-        <w:t xml:space="preserve"> </w:t>
-      </w:r>
-      <w:r>
-        <w:rPr>
-          <w:rFonts w:asciiTheme="minorHAnsi" w:hAnsiTheme="minorHAnsi" w:cstheme="minorHAnsi"/>
-          <w:lang w:val="es-ES"/>
-        </w:rPr>
-        <w:t>[</w:t>
+        <w:t xml:space="preserve"> [</w:t>
       </w:r>
       <w:r>
         <w:rPr>
@@ -867,8 +860,6 @@
         </w:rPr>
         <w:t xml:space="preserve"> GPS</w:t>
       </w:r>
-      <w:bookmarkStart w:id="0" w:name="_GoBack"/>
-      <w:bookmarkEnd w:id="0"/>
     </w:p>
     <w:p>
       <w:pPr>
@@ -1122,7 +1113,16 @@
           <w:rFonts w:asciiTheme="minorHAnsi" w:hAnsiTheme="minorHAnsi" w:cstheme="minorHAnsi"/>
           <w:lang w:val="es-ES"/>
         </w:rPr>
-        <w:t>) visual dinámico que notifica en color rojo cuando una dirección no es encontrada, no existe o presenta errores de digitación, impidiendo guardar registros con ubicación inválida.</w:t>
+        <w:t xml:space="preserve">) </w:t>
+      </w:r>
+      <w:bookmarkStart w:id="0" w:name="_GoBack"/>
+      <w:bookmarkEnd w:id="0"/>
+      <w:r>
+        <w:rPr>
+          <w:rFonts w:asciiTheme="minorHAnsi" w:hAnsiTheme="minorHAnsi" w:cstheme="minorHAnsi"/>
+          <w:lang w:val="es-ES"/>
+        </w:rPr>
+        <w:t>visual dinámico que notifica en color rojo cuando una dirección no es encontrada, no existe o presenta errores de digitación, impidiendo guardar registros con ubicación inválida.</w:t>
       </w:r>
     </w:p>
     <w:p>
@@ -1132,6 +1132,1259 @@
           <w:rFonts w:eastAsia="Times New Roman" w:cstheme="minorHAnsi"/>
           <w:sz w:val="24"/>
           <w:szCs w:val="24"/>
+          <w:lang w:val="es-ES"/>
+        </w:rPr>
+      </w:pPr>
+    </w:p>
+    <w:p>
+      <w:pPr>
+        <w:pStyle w:val="Ttulo3"/>
+        <w:rPr>
+          <w:rFonts w:asciiTheme="minorHAnsi" w:hAnsiTheme="minorHAnsi" w:cstheme="minorHAnsi"/>
+          <w:sz w:val="24"/>
+          <w:szCs w:val="24"/>
+        </w:rPr>
+      </w:pPr>
+    </w:p>
+    <w:p>
+      <w:pPr>
+        <w:pStyle w:val="Ttulo3"/>
+        <w:rPr>
+          <w:rFonts w:asciiTheme="minorHAnsi" w:hAnsiTheme="minorHAnsi" w:cstheme="minorHAnsi"/>
+          <w:sz w:val="24"/>
+          <w:szCs w:val="24"/>
+        </w:rPr>
+      </w:pPr>
+    </w:p>
+    <w:p>
+      <w:pPr>
+        <w:pStyle w:val="Ttulo3"/>
+        <w:rPr>
+          <w:rFonts w:asciiTheme="minorHAnsi" w:hAnsiTheme="minorHAnsi" w:cstheme="minorHAnsi"/>
+          <w:sz w:val="24"/>
+          <w:szCs w:val="24"/>
+        </w:rPr>
+      </w:pPr>
+      <w:proofErr w:type="spellStart"/>
+      <w:r>
+        <w:rPr>
+          <w:rFonts w:asciiTheme="minorHAnsi" w:hAnsiTheme="minorHAnsi" w:cstheme="minorHAnsi"/>
+          <w:sz w:val="24"/>
+          <w:szCs w:val="24"/>
+        </w:rPr>
+        <w:lastRenderedPageBreak/>
+        <w:t>Historia</w:t>
+      </w:r>
+      <w:proofErr w:type="spellEnd"/>
+      <w:r>
+        <w:rPr>
+          <w:rFonts w:asciiTheme="minorHAnsi" w:hAnsiTheme="minorHAnsi" w:cstheme="minorHAnsi"/>
+          <w:sz w:val="24"/>
+          <w:szCs w:val="24"/>
+        </w:rPr>
+        <w:t xml:space="preserve"> de </w:t>
+      </w:r>
+      <w:proofErr w:type="spellStart"/>
+      <w:r>
+        <w:rPr>
+          <w:rFonts w:asciiTheme="minorHAnsi" w:hAnsiTheme="minorHAnsi" w:cstheme="minorHAnsi"/>
+          <w:sz w:val="24"/>
+          <w:szCs w:val="24"/>
+        </w:rPr>
+        <w:t>Usuario</w:t>
+      </w:r>
+      <w:proofErr w:type="spellEnd"/>
+      <w:r>
+        <w:rPr>
+          <w:rFonts w:asciiTheme="minorHAnsi" w:hAnsiTheme="minorHAnsi" w:cstheme="minorHAnsi"/>
+          <w:sz w:val="24"/>
+          <w:szCs w:val="24"/>
+        </w:rPr>
+        <w:t xml:space="preserve"> 3</w:t>
+      </w:r>
+    </w:p>
+    <w:p>
+      <w:pPr>
+        <w:pStyle w:val="NormalWeb"/>
+        <w:numPr>
+          <w:ilvl w:val="0"/>
+          <w:numId w:val="5"/>
+        </w:numPr>
+        <w:rPr>
+          <w:rFonts w:asciiTheme="minorHAnsi" w:hAnsiTheme="minorHAnsi" w:cstheme="minorHAnsi"/>
+        </w:rPr>
+      </w:pPr>
+      <w:r>
+        <w:rPr>
+          <w:rFonts w:asciiTheme="minorHAnsi" w:hAnsiTheme="minorHAnsi" w:cstheme="minorHAnsi"/>
+          <w:b/>
+          <w:bCs/>
+        </w:rPr>
+        <w:t>[</w:t>
+      </w:r>
+      <w:proofErr w:type="spellStart"/>
+      <w:r>
+        <w:rPr>
+          <w:rFonts w:asciiTheme="minorHAnsi" w:hAnsiTheme="minorHAnsi" w:cstheme="minorHAnsi"/>
+          <w:b/>
+          <w:bCs/>
+        </w:rPr>
+        <w:t>si</w:t>
+      </w:r>
+      <w:proofErr w:type="spellEnd"/>
+      <w:r>
+        <w:rPr>
+          <w:rFonts w:asciiTheme="minorHAnsi" w:hAnsiTheme="minorHAnsi" w:cstheme="minorHAnsi"/>
+          <w:b/>
+          <w:bCs/>
+        </w:rPr>
+        <w:t xml:space="preserve">] </w:t>
+      </w:r>
+      <w:proofErr w:type="spellStart"/>
+      <w:r>
+        <w:rPr>
+          <w:rFonts w:asciiTheme="minorHAnsi" w:hAnsiTheme="minorHAnsi" w:cstheme="minorHAnsi"/>
+          <w:b/>
+          <w:bCs/>
+        </w:rPr>
+        <w:t>Mostrar</w:t>
+      </w:r>
+      <w:proofErr w:type="spellEnd"/>
+      <w:r>
+        <w:rPr>
+          <w:rFonts w:asciiTheme="minorHAnsi" w:hAnsiTheme="minorHAnsi" w:cstheme="minorHAnsi"/>
+          <w:b/>
+          <w:bCs/>
+        </w:rPr>
+        <w:t xml:space="preserve"> </w:t>
+      </w:r>
+      <w:proofErr w:type="spellStart"/>
+      <w:r>
+        <w:rPr>
+          <w:rFonts w:asciiTheme="minorHAnsi" w:hAnsiTheme="minorHAnsi" w:cstheme="minorHAnsi"/>
+          <w:b/>
+          <w:bCs/>
+        </w:rPr>
+        <w:t>marcador</w:t>
+      </w:r>
+      <w:proofErr w:type="spellEnd"/>
+    </w:p>
+    <w:p>
+      <w:pPr>
+        <w:pStyle w:val="NormalWeb"/>
+        <w:numPr>
+          <w:ilvl w:val="1"/>
+          <w:numId w:val="5"/>
+        </w:numPr>
+        <w:rPr>
+          <w:rFonts w:asciiTheme="minorHAnsi" w:hAnsiTheme="minorHAnsi" w:cstheme="minorHAnsi"/>
+          <w:lang w:val="es-ES"/>
+        </w:rPr>
+      </w:pPr>
+      <w:r>
+        <w:rPr>
+          <w:rFonts w:asciiTheme="minorHAnsi" w:hAnsiTheme="minorHAnsi" w:cstheme="minorHAnsi"/>
+          <w:b/>
+          <w:bCs/>
+          <w:lang w:val="es-ES"/>
+        </w:rPr>
+        <w:t>Implementado:</w:t>
+      </w:r>
+      <w:r>
+        <w:rPr>
+          <w:rFonts w:asciiTheme="minorHAnsi" w:hAnsiTheme="minorHAnsi" w:cstheme="minorHAnsi"/>
+          <w:lang w:val="es-ES"/>
+        </w:rPr>
+        <w:t xml:space="preserve"> Despliegue de indicador y estado del GPS activo ("Marcador Activo") en la tabla de clientes, con visor modal secundario embebido en Google </w:t>
+      </w:r>
+      <w:proofErr w:type="spellStart"/>
+      <w:r>
+        <w:rPr>
+          <w:rFonts w:asciiTheme="minorHAnsi" w:hAnsiTheme="minorHAnsi" w:cstheme="minorHAnsi"/>
+          <w:lang w:val="es-ES"/>
+        </w:rPr>
+        <w:t>Maps</w:t>
+      </w:r>
+      <w:proofErr w:type="spellEnd"/>
+      <w:r>
+        <w:rPr>
+          <w:rFonts w:asciiTheme="minorHAnsi" w:hAnsiTheme="minorHAnsi" w:cstheme="minorHAnsi"/>
+          <w:lang w:val="es-ES"/>
+        </w:rPr>
+        <w:t xml:space="preserve"> centrado en la ubicación exacta del domicilio.</w:t>
+      </w:r>
+    </w:p>
+    <w:p>
+      <w:pPr>
+        <w:pStyle w:val="NormalWeb"/>
+        <w:numPr>
+          <w:ilvl w:val="0"/>
+          <w:numId w:val="5"/>
+        </w:numPr>
+        <w:rPr>
+          <w:rFonts w:asciiTheme="minorHAnsi" w:hAnsiTheme="minorHAnsi" w:cstheme="minorHAnsi"/>
+        </w:rPr>
+      </w:pPr>
+      <w:r>
+        <w:rPr>
+          <w:rFonts w:asciiTheme="minorHAnsi" w:hAnsiTheme="minorHAnsi" w:cstheme="minorHAnsi"/>
+          <w:b/>
+          <w:bCs/>
+        </w:rPr>
+        <w:t>[</w:t>
+      </w:r>
+      <w:proofErr w:type="spellStart"/>
+      <w:r>
+        <w:rPr>
+          <w:rFonts w:asciiTheme="minorHAnsi" w:hAnsiTheme="minorHAnsi" w:cstheme="minorHAnsi"/>
+          <w:b/>
+          <w:bCs/>
+        </w:rPr>
+        <w:t>si</w:t>
+      </w:r>
+      <w:proofErr w:type="spellEnd"/>
+      <w:r>
+        <w:rPr>
+          <w:rFonts w:asciiTheme="minorHAnsi" w:hAnsiTheme="minorHAnsi" w:cstheme="minorHAnsi"/>
+          <w:b/>
+          <w:bCs/>
+        </w:rPr>
+        <w:t xml:space="preserve">] </w:t>
+      </w:r>
+      <w:proofErr w:type="spellStart"/>
+      <w:r>
+        <w:rPr>
+          <w:rFonts w:asciiTheme="minorHAnsi" w:hAnsiTheme="minorHAnsi" w:cstheme="minorHAnsi"/>
+          <w:b/>
+          <w:bCs/>
+        </w:rPr>
+        <w:t>Ver</w:t>
+      </w:r>
+      <w:proofErr w:type="spellEnd"/>
+      <w:r>
+        <w:rPr>
+          <w:rFonts w:asciiTheme="minorHAnsi" w:hAnsiTheme="minorHAnsi" w:cstheme="minorHAnsi"/>
+          <w:b/>
+          <w:bCs/>
+        </w:rPr>
+        <w:t xml:space="preserve"> </w:t>
+      </w:r>
+      <w:proofErr w:type="spellStart"/>
+      <w:r>
+        <w:rPr>
+          <w:rFonts w:asciiTheme="minorHAnsi" w:hAnsiTheme="minorHAnsi" w:cstheme="minorHAnsi"/>
+          <w:b/>
+          <w:bCs/>
+        </w:rPr>
+        <w:t>comuna</w:t>
+      </w:r>
+      <w:proofErr w:type="spellEnd"/>
+    </w:p>
+    <w:p>
+      <w:pPr>
+        <w:pStyle w:val="NormalWeb"/>
+        <w:numPr>
+          <w:ilvl w:val="1"/>
+          <w:numId w:val="5"/>
+        </w:numPr>
+        <w:rPr>
+          <w:rFonts w:asciiTheme="minorHAnsi" w:hAnsiTheme="minorHAnsi" w:cstheme="minorHAnsi"/>
+          <w:lang w:val="es-ES"/>
+        </w:rPr>
+      </w:pPr>
+      <w:r>
+        <w:rPr>
+          <w:rFonts w:asciiTheme="minorHAnsi" w:hAnsiTheme="minorHAnsi" w:cstheme="minorHAnsi"/>
+          <w:b/>
+          <w:bCs/>
+          <w:lang w:val="es-ES"/>
+        </w:rPr>
+        <w:t>Implementado:</w:t>
+      </w:r>
+      <w:r>
+        <w:rPr>
+          <w:rFonts w:asciiTheme="minorHAnsi" w:hAnsiTheme="minorHAnsi" w:cstheme="minorHAnsi"/>
+          <w:lang w:val="es-ES"/>
+        </w:rPr>
+        <w:t xml:space="preserve"> Visualización directa y filtrada de la comuna y región asociada al cliente, tanto en las filas de la tabla principal como en el detalle del visor geográfico.</w:t>
+      </w:r>
+    </w:p>
+    <w:p>
+      <w:pPr>
+        <w:pStyle w:val="NormalWeb"/>
+        <w:numPr>
+          <w:ilvl w:val="0"/>
+          <w:numId w:val="5"/>
+        </w:numPr>
+        <w:rPr>
+          <w:rFonts w:asciiTheme="minorHAnsi" w:hAnsiTheme="minorHAnsi" w:cstheme="minorHAnsi"/>
+        </w:rPr>
+      </w:pPr>
+      <w:r>
+        <w:rPr>
+          <w:rFonts w:asciiTheme="minorHAnsi" w:hAnsiTheme="minorHAnsi" w:cstheme="minorHAnsi"/>
+          <w:b/>
+          <w:bCs/>
+        </w:rPr>
+        <w:t>[</w:t>
+      </w:r>
+      <w:proofErr w:type="spellStart"/>
+      <w:r>
+        <w:rPr>
+          <w:rFonts w:asciiTheme="minorHAnsi" w:hAnsiTheme="minorHAnsi" w:cstheme="minorHAnsi"/>
+          <w:b/>
+          <w:bCs/>
+        </w:rPr>
+        <w:t>si</w:t>
+      </w:r>
+      <w:proofErr w:type="spellEnd"/>
+      <w:r>
+        <w:rPr>
+          <w:rFonts w:asciiTheme="minorHAnsi" w:hAnsiTheme="minorHAnsi" w:cstheme="minorHAnsi"/>
+          <w:b/>
+          <w:bCs/>
+        </w:rPr>
+        <w:t xml:space="preserve">] </w:t>
+      </w:r>
+      <w:proofErr w:type="spellStart"/>
+      <w:r>
+        <w:rPr>
+          <w:rFonts w:asciiTheme="minorHAnsi" w:hAnsiTheme="minorHAnsi" w:cstheme="minorHAnsi"/>
+          <w:b/>
+          <w:bCs/>
+        </w:rPr>
+        <w:t>Calcular</w:t>
+      </w:r>
+      <w:proofErr w:type="spellEnd"/>
+      <w:r>
+        <w:rPr>
+          <w:rFonts w:asciiTheme="minorHAnsi" w:hAnsiTheme="minorHAnsi" w:cstheme="minorHAnsi"/>
+          <w:b/>
+          <w:bCs/>
+        </w:rPr>
+        <w:t xml:space="preserve"> </w:t>
+      </w:r>
+      <w:proofErr w:type="spellStart"/>
+      <w:r>
+        <w:rPr>
+          <w:rFonts w:asciiTheme="minorHAnsi" w:hAnsiTheme="minorHAnsi" w:cstheme="minorHAnsi"/>
+          <w:b/>
+          <w:bCs/>
+        </w:rPr>
+        <w:t>distancia</w:t>
+      </w:r>
+      <w:proofErr w:type="spellEnd"/>
+    </w:p>
+    <w:p>
+      <w:pPr>
+        <w:pStyle w:val="NormalWeb"/>
+        <w:numPr>
+          <w:ilvl w:val="1"/>
+          <w:numId w:val="5"/>
+        </w:numPr>
+        <w:rPr>
+          <w:rFonts w:asciiTheme="minorHAnsi" w:hAnsiTheme="minorHAnsi" w:cstheme="minorHAnsi"/>
+          <w:lang w:val="es-ES"/>
+        </w:rPr>
+      </w:pPr>
+      <w:r>
+        <w:rPr>
+          <w:rFonts w:asciiTheme="minorHAnsi" w:hAnsiTheme="minorHAnsi" w:cstheme="minorHAnsi"/>
+          <w:b/>
+          <w:bCs/>
+          <w:lang w:val="es-ES"/>
+        </w:rPr>
+        <w:t>Implementado:</w:t>
+      </w:r>
+      <w:r>
+        <w:rPr>
+          <w:rFonts w:asciiTheme="minorHAnsi" w:hAnsiTheme="minorHAnsi" w:cstheme="minorHAnsi"/>
+          <w:lang w:val="es-ES"/>
+        </w:rPr>
+        <w:t xml:space="preserve"> Cálculo automático de la distancia real en kilómetros (</w:t>
+      </w:r>
+      <w:proofErr w:type="spellStart"/>
+      <w:r>
+        <w:rPr>
+          <w:rStyle w:val="CdigoHTML"/>
+          <w:rFonts w:asciiTheme="minorHAnsi" w:hAnsiTheme="minorHAnsi" w:cstheme="minorHAnsi"/>
+          <w:sz w:val="24"/>
+          <w:szCs w:val="24"/>
+          <w:lang w:val="es-ES"/>
+        </w:rPr>
+        <w:t>distanciaKm</w:t>
+      </w:r>
+      <w:proofErr w:type="spellEnd"/>
+      <w:r>
+        <w:rPr>
+          <w:rFonts w:asciiTheme="minorHAnsi" w:hAnsiTheme="minorHAnsi" w:cstheme="minorHAnsi"/>
+          <w:lang w:val="es-ES"/>
+        </w:rPr>
+        <w:t xml:space="preserve">) desde la central/base operativa (Lo Barnechea) hacia la dirección del cliente mediante la fórmula de </w:t>
+      </w:r>
+      <w:proofErr w:type="spellStart"/>
+      <w:r>
+        <w:rPr>
+          <w:rFonts w:asciiTheme="minorHAnsi" w:hAnsiTheme="minorHAnsi" w:cstheme="minorHAnsi"/>
+          <w:lang w:val="es-ES"/>
+        </w:rPr>
+        <w:t>Haversine</w:t>
+      </w:r>
+      <w:proofErr w:type="spellEnd"/>
+      <w:r>
+        <w:rPr>
+          <w:rFonts w:asciiTheme="minorHAnsi" w:hAnsiTheme="minorHAnsi" w:cstheme="minorHAnsi"/>
+          <w:lang w:val="es-ES"/>
+        </w:rPr>
+        <w:t xml:space="preserve"> ajustada por factor de trayecto urbano.</w:t>
+      </w:r>
+    </w:p>
+    <w:p>
+      <w:pPr>
+        <w:pStyle w:val="NormalWeb"/>
+        <w:numPr>
+          <w:ilvl w:val="0"/>
+          <w:numId w:val="5"/>
+        </w:numPr>
+        <w:rPr>
+          <w:rFonts w:asciiTheme="minorHAnsi" w:hAnsiTheme="minorHAnsi" w:cstheme="minorHAnsi"/>
+        </w:rPr>
+      </w:pPr>
+      <w:r>
+        <w:rPr>
+          <w:rFonts w:asciiTheme="minorHAnsi" w:hAnsiTheme="minorHAnsi" w:cstheme="minorHAnsi"/>
+          <w:b/>
+          <w:bCs/>
+        </w:rPr>
+        <w:t>[</w:t>
+      </w:r>
+      <w:proofErr w:type="spellStart"/>
+      <w:r>
+        <w:rPr>
+          <w:rFonts w:asciiTheme="minorHAnsi" w:hAnsiTheme="minorHAnsi" w:cstheme="minorHAnsi"/>
+          <w:b/>
+          <w:bCs/>
+        </w:rPr>
+        <w:t>si</w:t>
+      </w:r>
+      <w:proofErr w:type="spellEnd"/>
+      <w:r>
+        <w:rPr>
+          <w:rFonts w:asciiTheme="minorHAnsi" w:hAnsiTheme="minorHAnsi" w:cstheme="minorHAnsi"/>
+          <w:b/>
+          <w:bCs/>
+        </w:rPr>
+        <w:t xml:space="preserve">] </w:t>
+      </w:r>
+      <w:proofErr w:type="spellStart"/>
+      <w:r>
+        <w:rPr>
+          <w:rFonts w:asciiTheme="minorHAnsi" w:hAnsiTheme="minorHAnsi" w:cstheme="minorHAnsi"/>
+          <w:b/>
+          <w:bCs/>
+        </w:rPr>
+        <w:t>Tiempo</w:t>
+      </w:r>
+      <w:proofErr w:type="spellEnd"/>
+      <w:r>
+        <w:rPr>
+          <w:rFonts w:asciiTheme="minorHAnsi" w:hAnsiTheme="minorHAnsi" w:cstheme="minorHAnsi"/>
+          <w:b/>
+          <w:bCs/>
+        </w:rPr>
+        <w:t xml:space="preserve"> </w:t>
+      </w:r>
+      <w:proofErr w:type="spellStart"/>
+      <w:r>
+        <w:rPr>
+          <w:rFonts w:asciiTheme="minorHAnsi" w:hAnsiTheme="minorHAnsi" w:cstheme="minorHAnsi"/>
+          <w:b/>
+          <w:bCs/>
+        </w:rPr>
+        <w:t>estimado</w:t>
+      </w:r>
+      <w:proofErr w:type="spellEnd"/>
+      <w:r>
+        <w:rPr>
+          <w:rFonts w:asciiTheme="minorHAnsi" w:hAnsiTheme="minorHAnsi" w:cstheme="minorHAnsi"/>
+          <w:b/>
+          <w:bCs/>
+        </w:rPr>
+        <w:t xml:space="preserve"> de </w:t>
+      </w:r>
+      <w:proofErr w:type="spellStart"/>
+      <w:r>
+        <w:rPr>
+          <w:rFonts w:asciiTheme="minorHAnsi" w:hAnsiTheme="minorHAnsi" w:cstheme="minorHAnsi"/>
+          <w:b/>
+          <w:bCs/>
+        </w:rPr>
+        <w:t>viaje</w:t>
+      </w:r>
+      <w:proofErr w:type="spellEnd"/>
+    </w:p>
+    <w:p>
+      <w:pPr>
+        <w:pStyle w:val="NormalWeb"/>
+        <w:numPr>
+          <w:ilvl w:val="1"/>
+          <w:numId w:val="5"/>
+        </w:numPr>
+        <w:rPr>
+          <w:rFonts w:asciiTheme="minorHAnsi" w:hAnsiTheme="minorHAnsi" w:cstheme="minorHAnsi"/>
+          <w:lang w:val="es-ES"/>
+        </w:rPr>
+      </w:pPr>
+      <w:r>
+        <w:rPr>
+          <w:rFonts w:asciiTheme="minorHAnsi" w:hAnsiTheme="minorHAnsi" w:cstheme="minorHAnsi"/>
+          <w:b/>
+          <w:bCs/>
+          <w:lang w:val="es-ES"/>
+        </w:rPr>
+        <w:t>Implementado:</w:t>
+      </w:r>
+      <w:r>
+        <w:rPr>
+          <w:rFonts w:asciiTheme="minorHAnsi" w:hAnsiTheme="minorHAnsi" w:cstheme="minorHAnsi"/>
+          <w:lang w:val="es-ES"/>
+        </w:rPr>
+        <w:t xml:space="preserve"> Estimación dinámica del tiempo de traslado en minutos (</w:t>
+      </w:r>
+      <w:proofErr w:type="spellStart"/>
+      <w:r>
+        <w:rPr>
+          <w:rStyle w:val="CdigoHTML"/>
+          <w:rFonts w:asciiTheme="minorHAnsi" w:hAnsiTheme="minorHAnsi" w:cstheme="minorHAnsi"/>
+          <w:sz w:val="24"/>
+          <w:szCs w:val="24"/>
+          <w:lang w:val="es-ES"/>
+        </w:rPr>
+        <w:t>tiempoTrasladoMinutos</w:t>
+      </w:r>
+      <w:proofErr w:type="spellEnd"/>
+      <w:r>
+        <w:rPr>
+          <w:rFonts w:asciiTheme="minorHAnsi" w:hAnsiTheme="minorHAnsi" w:cstheme="minorHAnsi"/>
+          <w:lang w:val="es-ES"/>
+        </w:rPr>
+        <w:t>) basada en la distancia calculada y la velocidad promedio del flujo vehicular urbano, desplegada mediante etiquetas (</w:t>
+      </w:r>
+      <w:proofErr w:type="spellStart"/>
+      <w:r>
+        <w:rPr>
+          <w:rStyle w:val="CdigoHTML"/>
+          <w:rFonts w:asciiTheme="minorHAnsi" w:hAnsiTheme="minorHAnsi" w:cstheme="minorHAnsi"/>
+          <w:sz w:val="24"/>
+          <w:szCs w:val="24"/>
+          <w:lang w:val="es-ES"/>
+        </w:rPr>
+        <w:t>Tags</w:t>
+      </w:r>
+      <w:proofErr w:type="spellEnd"/>
+      <w:r>
+        <w:rPr>
+          <w:rFonts w:asciiTheme="minorHAnsi" w:hAnsiTheme="minorHAnsi" w:cstheme="minorHAnsi"/>
+          <w:lang w:val="es-ES"/>
+        </w:rPr>
+        <w:t>) visuales en la interfaz.</w:t>
+      </w:r>
+    </w:p>
+    <w:p>
+      <w:pPr>
+        <w:pStyle w:val="Ttulo3"/>
+        <w:rPr>
+          <w:rFonts w:asciiTheme="minorHAnsi" w:hAnsiTheme="minorHAnsi" w:cstheme="minorHAnsi"/>
+          <w:sz w:val="24"/>
+          <w:szCs w:val="24"/>
+          <w:lang w:val="es-ES"/>
+        </w:rPr>
+      </w:pPr>
+    </w:p>
+    <w:p>
+      <w:pPr>
+        <w:pStyle w:val="Ttulo3"/>
+        <w:rPr>
+          <w:rFonts w:asciiTheme="minorHAnsi" w:hAnsiTheme="minorHAnsi" w:cstheme="minorHAnsi"/>
+          <w:sz w:val="24"/>
+          <w:szCs w:val="24"/>
+        </w:rPr>
+      </w:pPr>
+      <w:proofErr w:type="spellStart"/>
+      <w:r>
+        <w:rPr>
+          <w:rFonts w:asciiTheme="minorHAnsi" w:hAnsiTheme="minorHAnsi" w:cstheme="minorHAnsi"/>
+          <w:sz w:val="24"/>
+          <w:szCs w:val="24"/>
+        </w:rPr>
+        <w:t>Verificación</w:t>
+      </w:r>
+      <w:proofErr w:type="spellEnd"/>
+      <w:r>
+        <w:rPr>
+          <w:rFonts w:asciiTheme="minorHAnsi" w:hAnsiTheme="minorHAnsi" w:cstheme="minorHAnsi"/>
+          <w:sz w:val="24"/>
+          <w:szCs w:val="24"/>
+        </w:rPr>
+        <w:t xml:space="preserve"> de </w:t>
+      </w:r>
+      <w:proofErr w:type="spellStart"/>
+      <w:r>
+        <w:rPr>
+          <w:rFonts w:asciiTheme="minorHAnsi" w:hAnsiTheme="minorHAnsi" w:cstheme="minorHAnsi"/>
+          <w:sz w:val="24"/>
+          <w:szCs w:val="24"/>
+        </w:rPr>
+        <w:t>Criterios</w:t>
+      </w:r>
+      <w:proofErr w:type="spellEnd"/>
+      <w:r>
+        <w:rPr>
+          <w:rFonts w:asciiTheme="minorHAnsi" w:hAnsiTheme="minorHAnsi" w:cstheme="minorHAnsi"/>
+          <w:sz w:val="24"/>
+          <w:szCs w:val="24"/>
+        </w:rPr>
+        <w:t xml:space="preserve"> - HU 4</w:t>
+      </w:r>
+    </w:p>
+    <w:p>
+      <w:pPr>
+        <w:pStyle w:val="NormalWeb"/>
+        <w:numPr>
+          <w:ilvl w:val="0"/>
+          <w:numId w:val="4"/>
+        </w:numPr>
+        <w:rPr>
+          <w:rFonts w:asciiTheme="minorHAnsi" w:hAnsiTheme="minorHAnsi" w:cstheme="minorHAnsi"/>
+          <w:lang w:val="es-ES"/>
+        </w:rPr>
+      </w:pPr>
+      <w:r>
+        <w:rPr>
+          <w:rFonts w:asciiTheme="minorHAnsi" w:hAnsiTheme="minorHAnsi" w:cstheme="minorHAnsi"/>
+          <w:b/>
+          <w:bCs/>
+          <w:lang w:val="es-ES"/>
+        </w:rPr>
+        <w:t>[si</w:t>
+      </w:r>
+      <w:r>
+        <w:rPr>
+          <w:rFonts w:asciiTheme="minorHAnsi" w:hAnsiTheme="minorHAnsi" w:cstheme="minorHAnsi"/>
+          <w:b/>
+          <w:bCs/>
+          <w:lang w:val="es-ES"/>
+        </w:rPr>
+        <w:t>] Categorías de Servicios Requeridas:</w:t>
+      </w:r>
+      <w:r>
+        <w:rPr>
+          <w:rFonts w:asciiTheme="minorHAnsi" w:hAnsiTheme="minorHAnsi" w:cstheme="minorHAnsi"/>
+          <w:lang w:val="es-ES"/>
+        </w:rPr>
+        <w:t xml:space="preserve"> Creadas en </w:t>
+      </w:r>
+      <w:proofErr w:type="spellStart"/>
+      <w:r>
+        <w:rPr>
+          <w:rStyle w:val="CdigoHTML"/>
+          <w:rFonts w:asciiTheme="minorHAnsi" w:hAnsiTheme="minorHAnsi" w:cstheme="minorHAnsi"/>
+          <w:sz w:val="24"/>
+          <w:szCs w:val="24"/>
+          <w:lang w:val="es-ES"/>
+        </w:rPr>
+        <w:t>src</w:t>
+      </w:r>
+      <w:proofErr w:type="spellEnd"/>
+      <w:r>
+        <w:rPr>
+          <w:rStyle w:val="CdigoHTML"/>
+          <w:rFonts w:asciiTheme="minorHAnsi" w:hAnsiTheme="minorHAnsi" w:cstheme="minorHAnsi"/>
+          <w:sz w:val="24"/>
+          <w:szCs w:val="24"/>
+          <w:lang w:val="es-ES"/>
+        </w:rPr>
+        <w:t>/</w:t>
+      </w:r>
+      <w:proofErr w:type="spellStart"/>
+      <w:r>
+        <w:rPr>
+          <w:rStyle w:val="CdigoHTML"/>
+          <w:rFonts w:asciiTheme="minorHAnsi" w:hAnsiTheme="minorHAnsi" w:cstheme="minorHAnsi"/>
+          <w:sz w:val="24"/>
+          <w:szCs w:val="24"/>
+          <w:lang w:val="es-ES"/>
+        </w:rPr>
+        <w:t>types</w:t>
+      </w:r>
+      <w:proofErr w:type="spellEnd"/>
+      <w:r>
+        <w:rPr>
+          <w:rStyle w:val="CdigoHTML"/>
+          <w:rFonts w:asciiTheme="minorHAnsi" w:hAnsiTheme="minorHAnsi" w:cstheme="minorHAnsi"/>
+          <w:sz w:val="24"/>
+          <w:szCs w:val="24"/>
+          <w:lang w:val="es-ES"/>
+        </w:rPr>
+        <w:t>/</w:t>
+      </w:r>
+      <w:proofErr w:type="spellStart"/>
+      <w:r>
+        <w:rPr>
+          <w:rStyle w:val="CdigoHTML"/>
+          <w:rFonts w:asciiTheme="minorHAnsi" w:hAnsiTheme="minorHAnsi" w:cstheme="minorHAnsi"/>
+          <w:sz w:val="24"/>
+          <w:szCs w:val="24"/>
+          <w:lang w:val="es-ES"/>
+        </w:rPr>
+        <w:t>servicio.ts</w:t>
+      </w:r>
+      <w:proofErr w:type="spellEnd"/>
+      <w:r>
+        <w:rPr>
+          <w:rFonts w:asciiTheme="minorHAnsi" w:hAnsiTheme="minorHAnsi" w:cstheme="minorHAnsi"/>
+          <w:lang w:val="es-ES"/>
+        </w:rPr>
+        <w:t xml:space="preserve"> y cargadas en </w:t>
+      </w:r>
+      <w:r>
+        <w:rPr>
+          <w:rStyle w:val="CdigoHTML"/>
+          <w:rFonts w:asciiTheme="minorHAnsi" w:hAnsiTheme="minorHAnsi" w:cstheme="minorHAnsi"/>
+          <w:sz w:val="24"/>
+          <w:szCs w:val="24"/>
+          <w:lang w:val="es-ES"/>
+        </w:rPr>
+        <w:t>SERVICIOS_BASE</w:t>
+      </w:r>
+      <w:r>
+        <w:rPr>
+          <w:rFonts w:asciiTheme="minorHAnsi" w:hAnsiTheme="minorHAnsi" w:cstheme="minorHAnsi"/>
+          <w:lang w:val="es-ES"/>
+        </w:rPr>
+        <w:t xml:space="preserve"> (Sofás, Sillones, Sillas, Colchones, Alfombras, Ventanas, Ventanales, Aseo profundo y Servicio combinado). </w:t>
+      </w:r>
+    </w:p>
+    <w:p>
+      <w:pPr>
+        <w:pStyle w:val="NormalWeb"/>
+        <w:numPr>
+          <w:ilvl w:val="0"/>
+          <w:numId w:val="4"/>
+        </w:numPr>
+        <w:rPr>
+          <w:rFonts w:asciiTheme="minorHAnsi" w:hAnsiTheme="minorHAnsi" w:cstheme="minorHAnsi"/>
+          <w:lang w:val="es-ES"/>
+        </w:rPr>
+      </w:pPr>
+      <w:r>
+        <w:rPr>
+          <w:rFonts w:asciiTheme="minorHAnsi" w:hAnsiTheme="minorHAnsi" w:cstheme="minorHAnsi"/>
+          <w:b/>
+          <w:bCs/>
+          <w:lang w:val="es-ES"/>
+        </w:rPr>
+        <w:t>[si</w:t>
+      </w:r>
+      <w:r>
+        <w:rPr>
+          <w:rFonts w:asciiTheme="minorHAnsi" w:hAnsiTheme="minorHAnsi" w:cstheme="minorHAnsi"/>
+          <w:b/>
+          <w:bCs/>
+          <w:lang w:val="es-ES"/>
+        </w:rPr>
+        <w:t>] Tiempo Estimado:</w:t>
+      </w:r>
+      <w:r>
+        <w:rPr>
+          <w:rFonts w:asciiTheme="minorHAnsi" w:hAnsiTheme="minorHAnsi" w:cstheme="minorHAnsi"/>
+          <w:lang w:val="es-ES"/>
+        </w:rPr>
+        <w:t xml:space="preserve"> Definido como valor base por defecto para cada tipo de servicio en minutos (modificable desde la pantalla del catálogo en </w:t>
+      </w:r>
+      <w:proofErr w:type="spellStart"/>
+      <w:r>
+        <w:rPr>
+          <w:rStyle w:val="CdigoHTML"/>
+          <w:rFonts w:asciiTheme="minorHAnsi" w:hAnsiTheme="minorHAnsi" w:cstheme="minorHAnsi"/>
+          <w:sz w:val="24"/>
+          <w:szCs w:val="24"/>
+          <w:lang w:val="es-ES"/>
+        </w:rPr>
+        <w:t>ServiciosPage.tsx</w:t>
+      </w:r>
+      <w:proofErr w:type="spellEnd"/>
+      <w:r>
+        <w:rPr>
+          <w:rFonts w:asciiTheme="minorHAnsi" w:hAnsiTheme="minorHAnsi" w:cstheme="minorHAnsi"/>
+          <w:lang w:val="es-ES"/>
+        </w:rPr>
+        <w:t xml:space="preserve">). </w:t>
+      </w:r>
+    </w:p>
+    <w:p>
+      <w:pPr>
+        <w:pStyle w:val="NormalWeb"/>
+        <w:numPr>
+          <w:ilvl w:val="0"/>
+          <w:numId w:val="4"/>
+        </w:numPr>
+        <w:rPr>
+          <w:rFonts w:asciiTheme="minorHAnsi" w:hAnsiTheme="minorHAnsi" w:cstheme="minorHAnsi"/>
+          <w:lang w:val="es-ES"/>
+        </w:rPr>
+      </w:pPr>
+      <w:r>
+        <w:rPr>
+          <w:rFonts w:asciiTheme="minorHAnsi" w:hAnsiTheme="minorHAnsi" w:cstheme="minorHAnsi"/>
+          <w:b/>
+          <w:bCs/>
+          <w:lang w:val="es-ES"/>
+        </w:rPr>
+        <w:t>[si</w:t>
+      </w:r>
+      <w:r>
+        <w:rPr>
+          <w:rFonts w:asciiTheme="minorHAnsi" w:hAnsiTheme="minorHAnsi" w:cstheme="minorHAnsi"/>
+          <w:b/>
+          <w:bCs/>
+          <w:lang w:val="es-ES"/>
+        </w:rPr>
+        <w:t>] Cantidad y Observaciones:</w:t>
+      </w:r>
+      <w:r>
+        <w:rPr>
+          <w:rFonts w:asciiTheme="minorHAnsi" w:hAnsiTheme="minorHAnsi" w:cstheme="minorHAnsi"/>
+          <w:lang w:val="es-ES"/>
+        </w:rPr>
+        <w:t xml:space="preserve"> Definidos dentro de la interfaz </w:t>
+      </w:r>
+      <w:proofErr w:type="spellStart"/>
+      <w:r>
+        <w:rPr>
+          <w:rStyle w:val="CdigoHTML"/>
+          <w:rFonts w:asciiTheme="minorHAnsi" w:hAnsiTheme="minorHAnsi" w:cstheme="minorHAnsi"/>
+          <w:sz w:val="24"/>
+          <w:szCs w:val="24"/>
+          <w:lang w:val="es-ES"/>
+        </w:rPr>
+        <w:t>ItemServicioSeleccionado</w:t>
+      </w:r>
+      <w:proofErr w:type="spellEnd"/>
+      <w:r>
+        <w:rPr>
+          <w:rFonts w:asciiTheme="minorHAnsi" w:hAnsiTheme="minorHAnsi" w:cstheme="minorHAnsi"/>
+          <w:lang w:val="es-ES"/>
+        </w:rPr>
+        <w:t xml:space="preserve"> en </w:t>
+      </w:r>
+      <w:proofErr w:type="spellStart"/>
+      <w:r>
+        <w:rPr>
+          <w:rStyle w:val="CdigoHTML"/>
+          <w:rFonts w:asciiTheme="minorHAnsi" w:hAnsiTheme="minorHAnsi" w:cstheme="minorHAnsi"/>
+          <w:sz w:val="24"/>
+          <w:szCs w:val="24"/>
+          <w:lang w:val="es-ES"/>
+        </w:rPr>
+        <w:t>servicio.ts</w:t>
+      </w:r>
+      <w:proofErr w:type="spellEnd"/>
+      <w:r>
+        <w:rPr>
+          <w:rFonts w:asciiTheme="minorHAnsi" w:hAnsiTheme="minorHAnsi" w:cstheme="minorHAnsi"/>
+          <w:lang w:val="es-ES"/>
+        </w:rPr>
+        <w:t xml:space="preserve">. Esto permitirá que, cuando el ejecutivo cree una orden o cita en los siguientes pasos, seleccione la cantidad de ítems (ej. 2 colchones) y agregue observaciones específicas. </w:t>
+      </w:r>
+    </w:p>
+    <w:p>
+      <w:pPr>
+        <w:pStyle w:val="NormalWeb"/>
+        <w:numPr>
+          <w:ilvl w:val="0"/>
+          <w:numId w:val="4"/>
+        </w:numPr>
+        <w:rPr>
+          <w:rFonts w:asciiTheme="minorHAnsi" w:hAnsiTheme="minorHAnsi" w:cstheme="minorHAnsi"/>
+          <w:lang w:val="es-ES"/>
+        </w:rPr>
+      </w:pPr>
+      <w:r>
+        <w:rPr>
+          <w:rFonts w:asciiTheme="minorHAnsi" w:hAnsiTheme="minorHAnsi" w:cstheme="minorHAnsi"/>
+          <w:b/>
+          <w:bCs/>
+          <w:lang w:val="es-ES"/>
+        </w:rPr>
+        <w:t>[si</w:t>
+      </w:r>
+      <w:r>
+        <w:rPr>
+          <w:rFonts w:asciiTheme="minorHAnsi" w:hAnsiTheme="minorHAnsi" w:cstheme="minorHAnsi"/>
+          <w:b/>
+          <w:bCs/>
+          <w:lang w:val="es-ES"/>
+        </w:rPr>
+        <w:t>] Mantenimiento y Estandarización:</w:t>
+      </w:r>
+      <w:r>
+        <w:rPr>
+          <w:rFonts w:asciiTheme="minorHAnsi" w:hAnsiTheme="minorHAnsi" w:cstheme="minorHAnsi"/>
+          <w:lang w:val="es-ES"/>
+        </w:rPr>
+        <w:t xml:space="preserve"> La pantalla </w:t>
+      </w:r>
+      <w:proofErr w:type="spellStart"/>
+      <w:r>
+        <w:rPr>
+          <w:rStyle w:val="CdigoHTML"/>
+          <w:rFonts w:asciiTheme="minorHAnsi" w:hAnsiTheme="minorHAnsi" w:cstheme="minorHAnsi"/>
+          <w:sz w:val="24"/>
+          <w:szCs w:val="24"/>
+          <w:lang w:val="es-ES"/>
+        </w:rPr>
+        <w:t>ServiciosPage.tsx</w:t>
+      </w:r>
+      <w:proofErr w:type="spellEnd"/>
+      <w:r>
+        <w:rPr>
+          <w:rFonts w:asciiTheme="minorHAnsi" w:hAnsiTheme="minorHAnsi" w:cstheme="minorHAnsi"/>
+          <w:lang w:val="es-ES"/>
+        </w:rPr>
+        <w:t xml:space="preserve"> le permite al ejecutivo o administrador activar/desactivar servicios y ajustar los tiempos estimados para mantener la información estandarizada.</w:t>
+      </w:r>
+    </w:p>
+    <w:p>
+      <w:pPr>
+        <w:pStyle w:val="Ttulo3"/>
+        <w:rPr>
+          <w:rFonts w:asciiTheme="minorHAnsi" w:hAnsiTheme="minorHAnsi" w:cstheme="minorHAnsi"/>
+          <w:sz w:val="24"/>
+          <w:szCs w:val="24"/>
+        </w:rPr>
+      </w:pPr>
+    </w:p>
+    <w:p>
+      <w:pPr>
+        <w:pStyle w:val="Ttulo3"/>
+        <w:rPr>
+          <w:rFonts w:asciiTheme="minorHAnsi" w:hAnsiTheme="minorHAnsi" w:cstheme="minorHAnsi"/>
+          <w:sz w:val="24"/>
+          <w:szCs w:val="24"/>
+        </w:rPr>
+      </w:pPr>
+    </w:p>
+    <w:p>
+      <w:pPr>
+        <w:pStyle w:val="Ttulo3"/>
+        <w:rPr>
+          <w:rFonts w:asciiTheme="minorHAnsi" w:hAnsiTheme="minorHAnsi" w:cstheme="minorHAnsi"/>
+          <w:sz w:val="24"/>
+          <w:szCs w:val="24"/>
+        </w:rPr>
+      </w:pPr>
+    </w:p>
+    <w:p>
+      <w:pPr>
+        <w:pStyle w:val="Ttulo3"/>
+        <w:rPr>
+          <w:rFonts w:asciiTheme="minorHAnsi" w:hAnsiTheme="minorHAnsi" w:cstheme="minorHAnsi"/>
+          <w:sz w:val="24"/>
+          <w:szCs w:val="24"/>
+        </w:rPr>
+      </w:pPr>
+      <w:proofErr w:type="spellStart"/>
+      <w:r>
+        <w:rPr>
+          <w:rFonts w:asciiTheme="minorHAnsi" w:hAnsiTheme="minorHAnsi" w:cstheme="minorHAnsi"/>
+          <w:sz w:val="24"/>
+          <w:szCs w:val="24"/>
+        </w:rPr>
+        <w:lastRenderedPageBreak/>
+        <w:t>Verificación</w:t>
+      </w:r>
+      <w:proofErr w:type="spellEnd"/>
+      <w:r>
+        <w:rPr>
+          <w:rFonts w:asciiTheme="minorHAnsi" w:hAnsiTheme="minorHAnsi" w:cstheme="minorHAnsi"/>
+          <w:sz w:val="24"/>
+          <w:szCs w:val="24"/>
+        </w:rPr>
+        <w:t xml:space="preserve"> de </w:t>
+      </w:r>
+      <w:proofErr w:type="spellStart"/>
+      <w:r>
+        <w:rPr>
+          <w:rFonts w:asciiTheme="minorHAnsi" w:hAnsiTheme="minorHAnsi" w:cstheme="minorHAnsi"/>
+          <w:sz w:val="24"/>
+          <w:szCs w:val="24"/>
+        </w:rPr>
+        <w:t>Criterios</w:t>
+      </w:r>
+      <w:proofErr w:type="spellEnd"/>
+      <w:r>
+        <w:rPr>
+          <w:rFonts w:asciiTheme="minorHAnsi" w:hAnsiTheme="minorHAnsi" w:cstheme="minorHAnsi"/>
+          <w:sz w:val="24"/>
+          <w:szCs w:val="24"/>
+        </w:rPr>
+        <w:t xml:space="preserve"> - HU 4</w:t>
+      </w:r>
+    </w:p>
+    <w:p>
+      <w:pPr>
+        <w:pStyle w:val="NormalWeb"/>
+        <w:ind w:left="720"/>
+        <w:rPr>
+          <w:lang w:val="es-ES"/>
+        </w:rPr>
+      </w:pPr>
+    </w:p>
+    <w:p>
+      <w:pPr>
+        <w:pStyle w:val="NormalWeb"/>
+        <w:ind w:left="720"/>
+        <w:rPr>
+          <w:lang w:val="es-ES"/>
+        </w:rPr>
+      </w:pPr>
+      <w:r>
+        <w:rPr>
+          <w:lang w:val="es-ES"/>
+        </w:rPr>
+        <w:t xml:space="preserve"> </w:t>
+      </w:r>
+      <w:r>
+        <w:rPr>
+          <w:lang w:val="es-ES"/>
+        </w:rPr>
+        <w:t xml:space="preserve">[si] </w:t>
+      </w:r>
+      <w:r>
+        <w:rPr>
+          <w:b/>
+          <w:bCs/>
+          <w:lang w:val="es-ES"/>
+        </w:rPr>
+        <w:t>Visualización y Filtro de Citas:</w:t>
+      </w:r>
+      <w:r>
+        <w:rPr>
+          <w:lang w:val="es-ES"/>
+        </w:rPr>
+        <w:t xml:space="preserve"> Muestra la lista de citas en un componente tipo tabla con la información clave (cliente, fecha, dirección, servicios y tiempos) y permite filtrar de forma dinámica por texto, estado o fecha.</w:t>
+      </w:r>
+    </w:p>
+    <w:p>
+      <w:pPr>
+        <w:pStyle w:val="NormalWeb"/>
+        <w:numPr>
+          <w:ilvl w:val="0"/>
+          <w:numId w:val="6"/>
+        </w:numPr>
+        <w:rPr>
+          <w:lang w:val="es-ES"/>
+        </w:rPr>
+      </w:pPr>
+      <w:r>
+        <w:rPr>
+          <w:lang w:val="es-ES"/>
+        </w:rPr>
+        <w:t xml:space="preserve">[si] </w:t>
+      </w:r>
+      <w:r>
+        <w:rPr>
+          <w:b/>
+          <w:bCs/>
+          <w:lang w:val="es-ES"/>
+        </w:rPr>
+        <w:t>Cálculo Dinámico de Tiempos:</w:t>
+      </w:r>
+      <w:r>
+        <w:rPr>
+          <w:lang w:val="es-ES"/>
+        </w:rPr>
+        <w:t xml:space="preserve"> Desglosa visualmente la duración total de los servicios, el tiempo estimado de traslado desde la base (Lo Barnechea) y calcula el bloque horario total requerido.</w:t>
+      </w:r>
+    </w:p>
+    <w:p>
+      <w:pPr>
+        <w:pStyle w:val="NormalWeb"/>
+        <w:numPr>
+          <w:ilvl w:val="0"/>
+          <w:numId w:val="6"/>
+        </w:numPr>
+        <w:rPr>
+          <w:lang w:val="es-ES"/>
+        </w:rPr>
+      </w:pPr>
+      <w:r>
+        <w:rPr>
+          <w:lang w:val="es-ES"/>
+        </w:rPr>
+        <w:t xml:space="preserve">[si] </w:t>
+      </w:r>
+      <w:r>
+        <w:rPr>
+          <w:b/>
+          <w:bCs/>
+          <w:lang w:val="es-ES"/>
+        </w:rPr>
+        <w:t>Agendamiento Inteligente:</w:t>
+      </w:r>
+      <w:r>
+        <w:rPr>
+          <w:lang w:val="es-ES"/>
+        </w:rPr>
+        <w:t xml:space="preserve"> Cuenta con un modal interactivo para crear una nueva cita, seleccionar el cliente, agregar ítems del catálogo de servicios con sus cantidades y calcular automáticamente la hora de término proyectada.</w:t>
+      </w:r>
+    </w:p>
+    <w:p>
+      <w:pPr>
+        <w:pStyle w:val="NormalWeb"/>
+        <w:numPr>
+          <w:ilvl w:val="0"/>
+          <w:numId w:val="6"/>
+        </w:numPr>
+        <w:rPr>
+          <w:lang w:val="es-ES"/>
+        </w:rPr>
+      </w:pPr>
+      <w:r>
+        <w:rPr>
+          <w:lang w:val="es-ES"/>
+        </w:rPr>
+        <w:t xml:space="preserve">[si] </w:t>
+      </w:r>
+      <w:r>
+        <w:rPr>
+          <w:b/>
+          <w:bCs/>
+          <w:lang w:val="es-ES"/>
+        </w:rPr>
+        <w:t>Gestión de Estados:</w:t>
+      </w:r>
+      <w:r>
+        <w:rPr>
+          <w:lang w:val="es-ES"/>
+        </w:rPr>
+        <w:t xml:space="preserve"> Permite la actualización directa del estado de la cita (</w:t>
+      </w:r>
+      <w:r>
+        <w:rPr>
+          <w:i/>
+          <w:iCs/>
+          <w:lang w:val="es-ES"/>
+        </w:rPr>
+        <w:t>Cotización, Pendiente, Confirmado, Programado, En Ruta, En Servicio, Finalizado, Reprogramado, Cancelado</w:t>
+      </w:r>
+      <w:r>
+        <w:rPr>
+          <w:lang w:val="es-ES"/>
+        </w:rPr>
+        <w:t>) mediante etiquetas de color descriptivas.</w:t>
+      </w:r>
+    </w:p>
+    <w:p>
+      <w:pPr>
+        <w:pStyle w:val="NormalWeb"/>
+        <w:numPr>
+          <w:ilvl w:val="0"/>
+          <w:numId w:val="6"/>
+        </w:numPr>
+        <w:rPr>
+          <w:lang w:val="es-ES"/>
+        </w:rPr>
+      </w:pPr>
+      <w:r>
+        <w:rPr>
+          <w:lang w:val="es-ES"/>
+        </w:rPr>
+        <w:t xml:space="preserve">[si] </w:t>
+      </w:r>
+      <w:r>
+        <w:rPr>
+          <w:b/>
+          <w:bCs/>
+          <w:lang w:val="es-ES"/>
+        </w:rPr>
+        <w:t xml:space="preserve">Integración al </w:t>
+      </w:r>
+      <w:proofErr w:type="spellStart"/>
+      <w:r>
+        <w:rPr>
+          <w:b/>
+          <w:bCs/>
+          <w:lang w:val="es-ES"/>
+        </w:rPr>
+        <w:t>MainLayout</w:t>
+      </w:r>
+      <w:proofErr w:type="spellEnd"/>
+      <w:r>
+        <w:rPr>
+          <w:b/>
+          <w:bCs/>
+          <w:lang w:val="es-ES"/>
+        </w:rPr>
+        <w:t>:</w:t>
+      </w:r>
+      <w:r>
+        <w:rPr>
+          <w:lang w:val="es-ES"/>
+        </w:rPr>
+        <w:t xml:space="preserve"> La vista está completamente integrada dentro de la navegación principal del sistema (</w:t>
+      </w:r>
+      <w:proofErr w:type="spellStart"/>
+      <w:r>
+        <w:rPr>
+          <w:rStyle w:val="CdigoHTML"/>
+          <w:lang w:val="es-ES"/>
+        </w:rPr>
+        <w:t>App.tsx</w:t>
+      </w:r>
+      <w:proofErr w:type="spellEnd"/>
+      <w:r>
+        <w:rPr>
+          <w:lang w:val="es-ES"/>
+        </w:rPr>
+        <w:t xml:space="preserve"> / </w:t>
+      </w:r>
+      <w:proofErr w:type="spellStart"/>
+      <w:r>
+        <w:rPr>
+          <w:rStyle w:val="CdigoHTML"/>
+          <w:lang w:val="es-ES"/>
+        </w:rPr>
+        <w:t>MainLayout.tsx</w:t>
+      </w:r>
+      <w:proofErr w:type="spellEnd"/>
+      <w:r>
+        <w:rPr>
+          <w:lang w:val="es-ES"/>
+        </w:rPr>
+        <w:t xml:space="preserve">) bajo la pestaña </w:t>
+      </w:r>
+      <w:r>
+        <w:rPr>
+          <w:b/>
+          <w:bCs/>
+          <w:lang w:val="es-ES"/>
+        </w:rPr>
+        <w:t>Agenda &amp; Servicios</w:t>
+      </w:r>
+      <w:r>
+        <w:rPr>
+          <w:lang w:val="es-ES"/>
+        </w:rPr>
+        <w:t>, manteniendo la arquitectura modular y limpia sin interferir con las demás páginas.</w:t>
+      </w:r>
+    </w:p>
+    <w:p>
+      <w:pPr>
+        <w:pStyle w:val="NormalWeb"/>
+        <w:rPr>
+          <w:rFonts w:asciiTheme="minorHAnsi" w:hAnsiTheme="minorHAnsi" w:cstheme="minorHAnsi"/>
           <w:lang w:val="es-ES"/>
         </w:rPr>
       </w:pPr>
@@ -1454,6 +2707,155 @@
     </w:lvl>
   </w:abstractNum>
   <w:abstractNum w:abstractNumId="2" w15:restartNumberingAfterBreak="0">
+    <w:nsid w:val="26DB4FC1"/>
+    <w:multiLevelType w:val="multilevel"/>
+    <w:tmpl w:val="CF00C034"/>
+    <w:lvl w:ilvl="0">
+      <w:start w:val="1"/>
+      <w:numFmt w:val="bullet"/>
+      <w:lvlText w:val=""/>
+      <w:lvlJc w:val="left"/>
+      <w:pPr>
+        <w:tabs>
+          <w:tab w:val="num" w:pos="720"/>
+        </w:tabs>
+        <w:ind w:left="720" w:hanging="360"/>
+      </w:pPr>
+      <w:rPr>
+        <w:rFonts w:ascii="Symbol" w:hAnsi="Symbol" w:hint="default"/>
+        <w:sz w:val="20"/>
+      </w:rPr>
+    </w:lvl>
+    <w:lvl w:ilvl="1">
+      <w:start w:val="1"/>
+      <w:numFmt w:val="bullet"/>
+      <w:lvlText w:val="o"/>
+      <w:lvlJc w:val="left"/>
+      <w:pPr>
+        <w:tabs>
+          <w:tab w:val="num" w:pos="1440"/>
+        </w:tabs>
+        <w:ind w:left="1440" w:hanging="360"/>
+      </w:pPr>
+      <w:rPr>
+        <w:rFonts w:ascii="Courier New" w:hAnsi="Courier New" w:hint="default"/>
+        <w:sz w:val="20"/>
+      </w:rPr>
+    </w:lvl>
+    <w:lvl w:ilvl="2" w:tentative="1">
+      <w:start w:val="1"/>
+      <w:numFmt w:val="bullet"/>
+      <w:lvlText w:val=""/>
+      <w:lvlJc w:val="left"/>
+      <w:pPr>
+        <w:tabs>
+          <w:tab w:val="num" w:pos="2160"/>
+        </w:tabs>
+        <w:ind w:left="2160" w:hanging="360"/>
+      </w:pPr>
+      <w:rPr>
+        <w:rFonts w:ascii="Wingdings" w:hAnsi="Wingdings" w:hint="default"/>
+        <w:sz w:val="20"/>
+      </w:rPr>
+    </w:lvl>
+    <w:lvl w:ilvl="3" w:tentative="1">
+      <w:start w:val="1"/>
+      <w:numFmt w:val="bullet"/>
+      <w:lvlText w:val=""/>
+      <w:lvlJc w:val="left"/>
+      <w:pPr>
+        <w:tabs>
+          <w:tab w:val="num" w:pos="2880"/>
+        </w:tabs>
+        <w:ind w:left="2880" w:hanging="360"/>
+      </w:pPr>
+      <w:rPr>
+        <w:rFonts w:ascii="Wingdings" w:hAnsi="Wingdings" w:hint="default"/>
+        <w:sz w:val="20"/>
+      </w:rPr>
+    </w:lvl>
+    <w:lvl w:ilvl="4" w:tentative="1">
+      <w:start w:val="1"/>
+      <w:numFmt w:val="bullet"/>
+      <w:lvlText w:val=""/>
+      <w:lvlJc w:val="left"/>
+      <w:pPr>
+        <w:tabs>
+          <w:tab w:val="num" w:pos="3600"/>
+        </w:tabs>
+        <w:ind w:left="3600" w:hanging="360"/>
+      </w:pPr>
+      <w:rPr>
+        <w:rFonts w:ascii="Wingdings" w:hAnsi="Wingdings" w:hint="default"/>
+        <w:sz w:val="20"/>
+      </w:rPr>
+    </w:lvl>
+    <w:lvl w:ilvl="5" w:tentative="1">
+      <w:start w:val="1"/>
+      <w:numFmt w:val="bullet"/>
+      <w:lvlText w:val=""/>
+      <w:lvlJc w:val="left"/>
+      <w:pPr>
+        <w:tabs>
+          <w:tab w:val="num" w:pos="4320"/>
+        </w:tabs>
+        <w:ind w:left="4320" w:hanging="360"/>
+      </w:pPr>
+      <w:rPr>
+        <w:rFonts w:ascii="Wingdings" w:hAnsi="Wingdings" w:hint="default"/>
+        <w:sz w:val="20"/>
+      </w:rPr>
+    </w:lvl>
+    <w:lvl w:ilvl="6" w:tentative="1">
+      <w:start w:val="1"/>
+      <w:numFmt w:val="bullet"/>
+      <w:lvlText w:val=""/>
+      <w:lvlJc w:val="left"/>
+      <w:pPr>
+        <w:tabs>
+          <w:tab w:val="num" w:pos="5040"/>
+        </w:tabs>
+        <w:ind w:left="5040" w:hanging="360"/>
+      </w:pPr>
+      <w:rPr>
+        <w:rFonts w:ascii="Wingdings" w:hAnsi="Wingdings" w:hint="default"/>
+        <w:sz w:val="20"/>
+      </w:rPr>
+    </w:lvl>
+    <w:lvl w:ilvl="7" w:tentative="1">
+      <w:start w:val="1"/>
+      <w:numFmt w:val="bullet"/>
+      <w:lvlText w:val=""/>
+      <w:lvlJc w:val="left"/>
+      <w:pPr>
+        <w:tabs>
+          <w:tab w:val="num" w:pos="5760"/>
+        </w:tabs>
+        <w:ind w:left="5760" w:hanging="360"/>
+      </w:pPr>
+      <w:rPr>
+        <w:rFonts w:ascii="Wingdings" w:hAnsi="Wingdings" w:hint="default"/>
+        <w:sz w:val="20"/>
+      </w:rPr>
+    </w:lvl>
+    <w:lvl w:ilvl="8" w:tentative="1">
+      <w:start w:val="1"/>
+      <w:numFmt w:val="bullet"/>
+      <w:lvlText w:val=""/>
+      <w:lvlJc w:val="left"/>
+      <w:pPr>
+        <w:tabs>
+          <w:tab w:val="num" w:pos="6480"/>
+        </w:tabs>
+        <w:ind w:left="6480" w:hanging="360"/>
+      </w:pPr>
+      <w:rPr>
+        <w:rFonts w:ascii="Wingdings" w:hAnsi="Wingdings" w:hint="default"/>
+        <w:sz w:val="20"/>
+      </w:rPr>
+    </w:lvl>
+  </w:abstractNum>
+  <w:abstractNum w:abstractNumId="3" w15:restartNumberingAfterBreak="0">
     <w:nsid w:val="39A112B9"/>
     <w:multiLevelType w:val="multilevel"/>
     <w:tmpl w:val="F6106776"/>
@@ -1474,6 +2876,304 @@
       </w:rPr>
     </w:lvl>
     <w:lvl w:ilvl="1">
+      <w:start w:val="1"/>
+      <w:numFmt w:val="bullet"/>
+      <w:lvlText w:val="o"/>
+      <w:lvlJc w:val="left"/>
+      <w:pPr>
+        <w:tabs>
+          <w:tab w:val="num" w:pos="1440"/>
+        </w:tabs>
+        <w:ind w:left="1440" w:hanging="360"/>
+      </w:pPr>
+      <w:rPr>
+        <w:rFonts w:ascii="Courier New" w:hAnsi="Courier New" w:hint="default"/>
+        <w:sz w:val="20"/>
+      </w:rPr>
+    </w:lvl>
+    <w:lvl w:ilvl="2" w:tentative="1">
+      <w:start w:val="1"/>
+      <w:numFmt w:val="bullet"/>
+      <w:lvlText w:val=""/>
+      <w:lvlJc w:val="left"/>
+      <w:pPr>
+        <w:tabs>
+          <w:tab w:val="num" w:pos="2160"/>
+        </w:tabs>
+        <w:ind w:left="2160" w:hanging="360"/>
+      </w:pPr>
+      <w:rPr>
+        <w:rFonts w:ascii="Wingdings" w:hAnsi="Wingdings" w:hint="default"/>
+        <w:sz w:val="20"/>
+      </w:rPr>
+    </w:lvl>
+    <w:lvl w:ilvl="3" w:tentative="1">
+      <w:start w:val="1"/>
+      <w:numFmt w:val="bullet"/>
+      <w:lvlText w:val=""/>
+      <w:lvlJc w:val="left"/>
+      <w:pPr>
+        <w:tabs>
+          <w:tab w:val="num" w:pos="2880"/>
+        </w:tabs>
+        <w:ind w:left="2880" w:hanging="360"/>
+      </w:pPr>
+      <w:rPr>
+        <w:rFonts w:ascii="Wingdings" w:hAnsi="Wingdings" w:hint="default"/>
+        <w:sz w:val="20"/>
+      </w:rPr>
+    </w:lvl>
+    <w:lvl w:ilvl="4" w:tentative="1">
+      <w:start w:val="1"/>
+      <w:numFmt w:val="bullet"/>
+      <w:lvlText w:val=""/>
+      <w:lvlJc w:val="left"/>
+      <w:pPr>
+        <w:tabs>
+          <w:tab w:val="num" w:pos="3600"/>
+        </w:tabs>
+        <w:ind w:left="3600" w:hanging="360"/>
+      </w:pPr>
+      <w:rPr>
+        <w:rFonts w:ascii="Wingdings" w:hAnsi="Wingdings" w:hint="default"/>
+        <w:sz w:val="20"/>
+      </w:rPr>
+    </w:lvl>
+    <w:lvl w:ilvl="5" w:tentative="1">
+      <w:start w:val="1"/>
+      <w:numFmt w:val="bullet"/>
+      <w:lvlText w:val=""/>
+      <w:lvlJc w:val="left"/>
+      <w:pPr>
+        <w:tabs>
+          <w:tab w:val="num" w:pos="4320"/>
+        </w:tabs>
+        <w:ind w:left="4320" w:hanging="360"/>
+      </w:pPr>
+      <w:rPr>
+        <w:rFonts w:ascii="Wingdings" w:hAnsi="Wingdings" w:hint="default"/>
+        <w:sz w:val="20"/>
+      </w:rPr>
+    </w:lvl>
+    <w:lvl w:ilvl="6" w:tentative="1">
+      <w:start w:val="1"/>
+      <w:numFmt w:val="bullet"/>
+      <w:lvlText w:val=""/>
+      <w:lvlJc w:val="left"/>
+      <w:pPr>
+        <w:tabs>
+          <w:tab w:val="num" w:pos="5040"/>
+        </w:tabs>
+        <w:ind w:left="5040" w:hanging="360"/>
+      </w:pPr>
+      <w:rPr>
+        <w:rFonts w:ascii="Wingdings" w:hAnsi="Wingdings" w:hint="default"/>
+        <w:sz w:val="20"/>
+      </w:rPr>
+    </w:lvl>
+    <w:lvl w:ilvl="7" w:tentative="1">
+      <w:start w:val="1"/>
+      <w:numFmt w:val="bullet"/>
+      <w:lvlText w:val=""/>
+      <w:lvlJc w:val="left"/>
+      <w:pPr>
+        <w:tabs>
+          <w:tab w:val="num" w:pos="5760"/>
+        </w:tabs>
+        <w:ind w:left="5760" w:hanging="360"/>
+      </w:pPr>
+      <w:rPr>
+        <w:rFonts w:ascii="Wingdings" w:hAnsi="Wingdings" w:hint="default"/>
+        <w:sz w:val="20"/>
+      </w:rPr>
+    </w:lvl>
+    <w:lvl w:ilvl="8" w:tentative="1">
+      <w:start w:val="1"/>
+      <w:numFmt w:val="bullet"/>
+      <w:lvlText w:val=""/>
+      <w:lvlJc w:val="left"/>
+      <w:pPr>
+        <w:tabs>
+          <w:tab w:val="num" w:pos="6480"/>
+        </w:tabs>
+        <w:ind w:left="6480" w:hanging="360"/>
+      </w:pPr>
+      <w:rPr>
+        <w:rFonts w:ascii="Wingdings" w:hAnsi="Wingdings" w:hint="default"/>
+        <w:sz w:val="20"/>
+      </w:rPr>
+    </w:lvl>
+  </w:abstractNum>
+  <w:abstractNum w:abstractNumId="4" w15:restartNumberingAfterBreak="0">
+    <w:nsid w:val="5EB75AEC"/>
+    <w:multiLevelType w:val="multilevel"/>
+    <w:tmpl w:val="94C0F974"/>
+    <w:lvl w:ilvl="0">
+      <w:start w:val="1"/>
+      <w:numFmt w:val="bullet"/>
+      <w:lvlText w:val=""/>
+      <w:lvlJc w:val="left"/>
+      <w:pPr>
+        <w:tabs>
+          <w:tab w:val="num" w:pos="720"/>
+        </w:tabs>
+        <w:ind w:left="720" w:hanging="360"/>
+      </w:pPr>
+      <w:rPr>
+        <w:rFonts w:ascii="Symbol" w:hAnsi="Symbol" w:hint="default"/>
+        <w:sz w:val="20"/>
+      </w:rPr>
+    </w:lvl>
+    <w:lvl w:ilvl="1" w:tentative="1">
+      <w:start w:val="1"/>
+      <w:numFmt w:val="bullet"/>
+      <w:lvlText w:val="o"/>
+      <w:lvlJc w:val="left"/>
+      <w:pPr>
+        <w:tabs>
+          <w:tab w:val="num" w:pos="1440"/>
+        </w:tabs>
+        <w:ind w:left="1440" w:hanging="360"/>
+      </w:pPr>
+      <w:rPr>
+        <w:rFonts w:ascii="Courier New" w:hAnsi="Courier New" w:hint="default"/>
+        <w:sz w:val="20"/>
+      </w:rPr>
+    </w:lvl>
+    <w:lvl w:ilvl="2" w:tentative="1">
+      <w:start w:val="1"/>
+      <w:numFmt w:val="bullet"/>
+      <w:lvlText w:val=""/>
+      <w:lvlJc w:val="left"/>
+      <w:pPr>
+        <w:tabs>
+          <w:tab w:val="num" w:pos="2160"/>
+        </w:tabs>
+        <w:ind w:left="2160" w:hanging="360"/>
+      </w:pPr>
+      <w:rPr>
+        <w:rFonts w:ascii="Wingdings" w:hAnsi="Wingdings" w:hint="default"/>
+        <w:sz w:val="20"/>
+      </w:rPr>
+    </w:lvl>
+    <w:lvl w:ilvl="3" w:tentative="1">
+      <w:start w:val="1"/>
+      <w:numFmt w:val="bullet"/>
+      <w:lvlText w:val=""/>
+      <w:lvlJc w:val="left"/>
+      <w:pPr>
+        <w:tabs>
+          <w:tab w:val="num" w:pos="2880"/>
+        </w:tabs>
+        <w:ind w:left="2880" w:hanging="360"/>
+      </w:pPr>
+      <w:rPr>
+        <w:rFonts w:ascii="Wingdings" w:hAnsi="Wingdings" w:hint="default"/>
+        <w:sz w:val="20"/>
+      </w:rPr>
+    </w:lvl>
+    <w:lvl w:ilvl="4" w:tentative="1">
+      <w:start w:val="1"/>
+      <w:numFmt w:val="bullet"/>
+      <w:lvlText w:val=""/>
+      <w:lvlJc w:val="left"/>
+      <w:pPr>
+        <w:tabs>
+          <w:tab w:val="num" w:pos="3600"/>
+        </w:tabs>
+        <w:ind w:left="3600" w:hanging="360"/>
+      </w:pPr>
+      <w:rPr>
+        <w:rFonts w:ascii="Wingdings" w:hAnsi="Wingdings" w:hint="default"/>
+        <w:sz w:val="20"/>
+      </w:rPr>
+    </w:lvl>
+    <w:lvl w:ilvl="5" w:tentative="1">
+      <w:start w:val="1"/>
+      <w:numFmt w:val="bullet"/>
+      <w:lvlText w:val=""/>
+      <w:lvlJc w:val="left"/>
+      <w:pPr>
+        <w:tabs>
+          <w:tab w:val="num" w:pos="4320"/>
+        </w:tabs>
+        <w:ind w:left="4320" w:hanging="360"/>
+      </w:pPr>
+      <w:rPr>
+        <w:rFonts w:ascii="Wingdings" w:hAnsi="Wingdings" w:hint="default"/>
+        <w:sz w:val="20"/>
+      </w:rPr>
+    </w:lvl>
+    <w:lvl w:ilvl="6" w:tentative="1">
+      <w:start w:val="1"/>
+      <w:numFmt w:val="bullet"/>
+      <w:lvlText w:val=""/>
+      <w:lvlJc w:val="left"/>
+      <w:pPr>
+        <w:tabs>
+          <w:tab w:val="num" w:pos="5040"/>
+        </w:tabs>
+        <w:ind w:left="5040" w:hanging="360"/>
+      </w:pPr>
+      <w:rPr>
+        <w:rFonts w:ascii="Wingdings" w:hAnsi="Wingdings" w:hint="default"/>
+        <w:sz w:val="20"/>
+      </w:rPr>
+    </w:lvl>
+    <w:lvl w:ilvl="7" w:tentative="1">
+      <w:start w:val="1"/>
+      <w:numFmt w:val="bullet"/>
+      <w:lvlText w:val=""/>
+      <w:lvlJc w:val="left"/>
+      <w:pPr>
+        <w:tabs>
+          <w:tab w:val="num" w:pos="5760"/>
+        </w:tabs>
+        <w:ind w:left="5760" w:hanging="360"/>
+      </w:pPr>
+      <w:rPr>
+        <w:rFonts w:ascii="Wingdings" w:hAnsi="Wingdings" w:hint="default"/>
+        <w:sz w:val="20"/>
+      </w:rPr>
+    </w:lvl>
+    <w:lvl w:ilvl="8" w:tentative="1">
+      <w:start w:val="1"/>
+      <w:numFmt w:val="bullet"/>
+      <w:lvlText w:val=""/>
+      <w:lvlJc w:val="left"/>
+      <w:pPr>
+        <w:tabs>
+          <w:tab w:val="num" w:pos="6480"/>
+        </w:tabs>
+        <w:ind w:left="6480" w:hanging="360"/>
+      </w:pPr>
+      <w:rPr>
+        <w:rFonts w:ascii="Wingdings" w:hAnsi="Wingdings" w:hint="default"/>
+        <w:sz w:val="20"/>
+      </w:rPr>
+    </w:lvl>
+  </w:abstractNum>
+  <w:abstractNum w:abstractNumId="5" w15:restartNumberingAfterBreak="0">
+    <w:nsid w:val="60DE63AF"/>
+    <w:multiLevelType w:val="multilevel"/>
+    <w:tmpl w:val="0ED0A230"/>
+    <w:lvl w:ilvl="0">
+      <w:start w:val="1"/>
+      <w:numFmt w:val="bullet"/>
+      <w:lvlText w:val=""/>
+      <w:lvlJc w:val="left"/>
+      <w:pPr>
+        <w:tabs>
+          <w:tab w:val="num" w:pos="720"/>
+        </w:tabs>
+        <w:ind w:left="720" w:hanging="360"/>
+      </w:pPr>
+      <w:rPr>
+        <w:rFonts w:ascii="Symbol" w:hAnsi="Symbol" w:hint="default"/>
+        <w:sz w:val="20"/>
+      </w:rPr>
+    </w:lvl>
+    <w:lvl w:ilvl="1" w:tentative="1">
       <w:start w:val="1"/>
       <w:numFmt w:val="bullet"/>
       <w:lvlText w:val="o"/>
@@ -1609,7 +3309,16 @@
     <w:abstractNumId w:val="0"/>
   </w:num>
   <w:num w:numId="3">
+    <w:abstractNumId w:val="3"/>
+  </w:num>
+  <w:num w:numId="4">
+    <w:abstractNumId w:val="4"/>
+  </w:num>
+  <w:num w:numId="5">
     <w:abstractNumId w:val="2"/>
+  </w:num>
+  <w:num w:numId="6">
+    <w:abstractNumId w:val="5"/>
   </w:num>
 </w:numbering>
 </file>

</xml_diff>